<commit_message>
Add AI error logging and infinite retries for endpoints
</commit_message>
<xml_diff>
--- a/Legal_Pleadings_SDD.docx
+++ b/Legal_Pleadings_SDD.docx
@@ -26,6 +26,24 @@
         </w:rPr>
         <w:t>Legal Pleadings</w:t>
       </w:r>
+    </w:p>
+    <w:p>
+      <w:pPr>
+        <w:jc w:val="center"/>
+        <w:rPr>
+          <w:sz w:val="44"/>
+          <w:szCs w:val="44"/>
+        </w:rPr>
+      </w:pPr>
+    </w:p>
+    <w:p>
+      <w:pPr>
+        <w:jc w:val="center"/>
+        <w:rPr>
+          <w:sz w:val="44"/>
+          <w:szCs w:val="44"/>
+        </w:rPr>
+      </w:pPr>
     </w:p>
     <w:p>
       <w:r>

</xml_diff>